<commit_message>
Jerusalem 01: replace duplicate questions 5,6,8,9; route example now Taglit
Co-Authored-By: Claude Opus 5.5 <noreply@anthropic.com>
Claude-Session: https://claude.ai/code/session_01AhWt76aQYnK2GHBZTwEpVE
</commit_message>
<xml_diff>
--- a/tayarut/jerusalem/01/worksheet.docx
+++ b/tayarut/jerusalem/01/worksheet.docx
@@ -7825,7 +7825,7 @@
           <w:i w:val="0"/>
           <w:rtl/>
         </w:rPr>
-        <w:t>ציינו את שמות האתרים הנחשבים כמקום קבורתו של ישו, ואיזה זרם בנצרות מאמין בכל אחד מהם.</w:t>
+        <w:t>לכל זרם בנצרות יש אתרים שחשובים לו במיוחד בירושלים. ציינו שני זרמים, ולכל זרם אתר אחד שחשוב לו והסבר מדוע.</w:t>
       </w:r>
       <w:r>
         <w:rPr>
@@ -7837,7 +7837,7 @@
           <w:szCs w:val="18"/>
           <w:rtl/>
         </w:rPr>
-        <w:t xml:space="preserve">  (בגרות 2023)</w:t>
+        <w:t xml:space="preserve">  (תרגול)</w:t>
       </w:r>
     </w:p>
     <w:tbl>
@@ -7859,22 +7859,6 @@
       <w:tblGrid>
         <w:gridCol w:w="9865"/>
       </w:tblGrid>
-      <w:tr>
-        <w:trPr>
-          <w:trHeight w:val="510"/>
-        </w:trPr>
-        <w:tc>
-          <w:tcPr>
-            <w:tcW w:type="dxa" w:w="9865"/>
-          </w:tcPr>
-          <w:p>
-            <w:pPr>
-              <w:keepNext/>
-              <w:bidi/>
-            </w:pPr>
-          </w:p>
-        </w:tc>
-      </w:tr>
       <w:tr>
         <w:trPr>
           <w:trHeight w:val="510"/>
@@ -7953,7 +7937,7 @@
           <w:i w:val="0"/>
           <w:rtl/>
         </w:rPr>
-        <w:t>בסביבות ירושלים יש שתי ערים שהן מוקד לעלייה לרגל: בית לחם וחברון. כתבו בקצרה מה מושך את התייר הנוצרי לבית לחם, ומה מושך את התייר היהודי ואת התייר המוסלמי לחברון.</w:t>
+        <w:t>בסביבות ירושלים נמצאים כנסיית המולד בבית לחם והרודיון. ציינו לגבי כל אתר מה מושך אליו תיירים, ואיזה סוג תיירות הוא מייצג.</w:t>
       </w:r>
       <w:r>
         <w:rPr>
@@ -7965,7 +7949,7 @@
           <w:szCs w:val="18"/>
           <w:rtl/>
         </w:rPr>
-        <w:t xml:space="preserve">  (ממאגר הבגרות)</w:t>
+        <w:t xml:space="preserve">  (בסגנון בגרות)</w:t>
       </w:r>
     </w:p>
     <w:tbl>
@@ -8260,7 +8244,7 @@
           <w:i w:val="0"/>
           <w:rtl/>
         </w:rPr>
-        <w:t>ציינו את שמותיהם של שני אתרים חשובים בירושלים שאפשר לכלול בתוכנית לעולי רגל מוסלמים, והסבירו את מקור חשיבותו של כל אתר.</w:t>
+        <w:t>אורחים רשמיים של מדינת ישראל מבקרים כמעט תמיד במוזיאון השואה בירושלים. ציינו את שם האתר, והסבירו שתי סיבות לכך שהוא נכלל בתוכניות הביקור הממלכתיות.</w:t>
       </w:r>
       <w:r>
         <w:rPr>
@@ -8272,7 +8256,7 @@
           <w:szCs w:val="18"/>
           <w:rtl/>
         </w:rPr>
-        <w:t xml:space="preserve">  (בגרות 2019)</w:t>
+        <w:t xml:space="preserve">  (בעקבות בגרות 2026)</w:t>
       </w:r>
     </w:p>
     <w:tbl>
@@ -8420,7 +8404,7 @@
           <w:i w:val="0"/>
           <w:rtl/>
         </w:rPr>
-        <w:t>ציינו ארבעה אתרי תיירות בירושלים החדשה: מוזיאון, אתר לבילוי לילי, אתר לבילוי עם ילדים קטנים, ואתר שהוא מסמלי השלטון ופתוח למבקרים.</w:t>
+        <w:t>בירושלים נמצאים מוסדות השלטון והתרבות של מדינת ישראל. ציינו שלושה מהם שאפשר לבקר בהם, ותארו אחד מהם.</w:t>
       </w:r>
       <w:r>
         <w:rPr>
@@ -8432,7 +8416,7 @@
           <w:szCs w:val="18"/>
           <w:rtl/>
         </w:rPr>
-        <w:t xml:space="preserve">  (בגרות 2024)</w:t>
+        <w:t xml:space="preserve">  (בעקבות בגרות 2026)</w:t>
       </w:r>
     </w:p>
     <w:tbl>
@@ -8454,6 +8438,38 @@
       <w:tblGrid>
         <w:gridCol w:w="9865"/>
       </w:tblGrid>
+      <w:tr>
+        <w:trPr>
+          <w:trHeight w:val="510"/>
+        </w:trPr>
+        <w:tc>
+          <w:tcPr>
+            <w:tcW w:type="dxa" w:w="9865"/>
+          </w:tcPr>
+          <w:p>
+            <w:pPr>
+              <w:keepNext/>
+              <w:bidi/>
+            </w:pPr>
+          </w:p>
+        </w:tc>
+      </w:tr>
+      <w:tr>
+        <w:trPr>
+          <w:trHeight w:val="510"/>
+        </w:trPr>
+        <w:tc>
+          <w:tcPr>
+            <w:tcW w:type="dxa" w:w="9865"/>
+          </w:tcPr>
+          <w:p>
+            <w:pPr>
+              <w:keepNext/>
+              <w:bidi/>
+            </w:pPr>
+          </w:p>
+        </w:tc>
+      </w:tr>
       <w:tr>
         <w:trPr>
           <w:trHeight w:val="510"/>

</xml_diff>

<commit_message>
Jerusalem 01: closing question split into Q12-14
Co-Authored-By: Claude Opus 5.5 <noreply@anthropic.com>
Claude-Session: https://claude.ai/code/session_01AhWt76aQYnK2GHBZTwEpVE
</commit_message>
<xml_diff>
--- a/tayarut/jerusalem/01/worksheet.docx
+++ b/tayarut/jerusalem/01/worksheet.docx
@@ -8895,7 +8895,7 @@
           <w:szCs w:val="25"/>
           <w:rtl/>
         </w:rPr>
-        <w:t>שאלה 12: ענו על 2 מתוך 3 הסעיפים</w:t>
+        <w:t>שאלות 12–14</w:t>
       </w:r>
     </w:p>
     <w:p>
@@ -8912,7 +8912,7 @@
           <w:i w:val="0"/>
           <w:rtl/>
         </w:rPr>
-        <w:t xml:space="preserve">א.  </w:t>
+        <w:t xml:space="preserve">12.  </w:t>
       </w:r>
       <w:r>
         <w:rPr>
@@ -9040,7 +9040,7 @@
           <w:i w:val="0"/>
           <w:rtl/>
         </w:rPr>
-        <w:t xml:space="preserve">ב.  </w:t>
+        <w:t xml:space="preserve">13.  </w:t>
       </w:r>
       <w:r>
         <w:rPr>
@@ -9168,7 +9168,7 @@
           <w:i w:val="0"/>
           <w:rtl/>
         </w:rPr>
-        <w:t xml:space="preserve">ג.  </w:t>
+        <w:t xml:space="preserve">14.  </w:t>
       </w:r>
       <w:r>
         <w:rPr>
@@ -9329,7 +9329,7 @@
           <w:szCs w:val="19"/>
           <w:rtl/>
         </w:rPr>
-        <w:t>כמו בבחינה: כל סעיף שווה 8.5 נקודות, וכל השאלה 17.</w:t>
+        <w:t>עונים על שלוש השאלות. בבחינה עצמה בוחרים לפעמים חלק מהסעיפים, אז קראו היטב את ההוראות.</w:t>
       </w:r>
     </w:p>
     <w:sectPr>

</xml_diff>